<commit_message>
Add Word review round-trip; apply reviewed edits and comments
review.py extracts tracked changes and comments from a reviewed .docx,
applies the deterministic text edits back into cv.html, and reports
anything needing judgement to REVIEW.md. build.sh now syncs the review
copy so each round starts from current content.

Content: applied 14 tracked edits and 5 review comments, dropped the
Google Scholar link, and expanded the LLM project with the nanochat
pipeline and repo link.

Co-Authored-By: Claude Opus 5 (1M context) <noreply@anthropic.com>
</commit_message>
<xml_diff>
--- a/dist/Xinyu_Guo_CV.docx
+++ b/dist/Xinyu_Guo_CV.docx
@@ -348,7 +348,7 @@
           <w:sz w:val="18"/>
           <w:u w:val="none"/>
         </w:rPr>
-        <w:t xml:space="preserve">Researched DNA foundation models — particularly sequence-to-function models such as AlphaGenome and Enigma — and applied them to an OncoExTra tumor cohort, </w:t>
+        <w:t xml:space="preserve">Researched DNA foundation models, particularly sequence-to-function models such as AlphaGenome and Enigma. Studied these state-of-the-art models against an OncoExTra tumor cohort, </w:t>
       </w:r>
       <w:r>
         <w:rPr>
@@ -370,7 +370,7 @@
           <w:sz w:val="18"/>
           <w:u w:val="none"/>
         </w:rPr>
-        <w:t xml:space="preserve"> that conventional snpEff annotation had deprioritized, and ranking them into a wet-lab handoff.</w:t>
+        <w:t xml:space="preserve"> that conventional snpEff annotation had deprioritized.</w:t>
       </w:r>
     </w:p>
     <w:p>
@@ -446,7 +446,7 @@
           <w:sz w:val="18"/>
           <w:u w:val="none"/>
         </w:rPr>
-        <w:t>.</w:t>
+        <w:t>, through to downstream modeling with task-specific classification heads.</w:t>
       </w:r>
     </w:p>
     <w:p>
@@ -478,7 +478,29 @@
           <w:sz w:val="18"/>
           <w:u w:val="none"/>
         </w:rPr>
-        <w:t xml:space="preserve">Built FFPE artifact-risk models on 87,307 raw somatic SNVs reaching </w:t>
+        <w:t xml:space="preserve">Built FFPE artifact-risk detection models over </w:t>
+      </w:r>
+      <w:r>
+        <w:rPr>
+          <w:rFonts w:ascii="Charter" w:hAnsi="Charter" w:cs="Charter"/>
+          <w:b/>
+          <w:i w:val="0"/>
+          <w:color w:val="14171A"/>
+          <w:sz w:val="18"/>
+          <w:u w:val="none"/>
+        </w:rPr>
+        <w:t>~140 GB</w:t>
+      </w:r>
+      <w:r>
+        <w:rPr>
+          <w:rFonts w:ascii="Charter" w:hAnsi="Charter" w:cs="Charter"/>
+          <w:b w:val="0"/>
+          <w:i w:val="0"/>
+          <w:color w:val="3A4046"/>
+          <w:sz w:val="18"/>
+          <w:u w:val="none"/>
+        </w:rPr>
+        <w:t xml:space="preserve"> of paired fresh-frozen and FFPE sequencing data, reaching </w:t>
       </w:r>
       <w:r>
         <w:rPr>
@@ -500,7 +522,7 @@
           <w:sz w:val="18"/>
           <w:u w:val="none"/>
         </w:rPr>
-        <w:t xml:space="preserve"> under leave-one-patient-out evaluation, against 0.677 (FFPErase), 0.517 (FFPolish), and 0.509 (FIFA) on the same cohort; scaled the pipeline to an 18.6M-row SEQC2 benchmark across five callers.</w:t>
+        <w:t xml:space="preserve"> against 0.677 (FFPErase), 0.517 (FFPolish), and 0.509 (FIFA) on the same cohort, and scaled the pipeline to an 18.6M-row SEQC2 benchmark across five variant callers.</w:t>
       </w:r>
     </w:p>
     <w:p>
@@ -532,7 +554,7 @@
           <w:sz w:val="18"/>
           <w:u w:val="none"/>
         </w:rPr>
-        <w:t xml:space="preserve">Extended the same sequence-to-function models from SNVs to structural rearrangements by building a reusable </w:t>
+        <w:t xml:space="preserve">Extended sequence-to-function models from SNVs to structural rearrangements by building a reusable </w:t>
       </w:r>
       <w:r>
         <w:rPr>
@@ -636,7 +658,7 @@
           <w:sz w:val="17"/>
           <w:u w:val="none"/>
         </w:rPr>
-        <w:t>Ph.D. dissertation research, biological foundation models · Advisor: Dr. Liang Chen</w:t>
+        <w:t>Biological pathology AI/ML modeling · Advisor: Dr. Liang Chen</w:t>
       </w:r>
     </w:p>
     <w:p>
@@ -690,7 +712,7 @@
           <w:sz w:val="18"/>
           <w:u w:val="none"/>
         </w:rPr>
-        <w:t xml:space="preserve"> integrating DNA sequence, RNA expression, and spatial transcriptomics to identify tissue-specific disease-risk regions, built around explainability so individual genetic variants map to interpretable spatial microenvironments rather than opaque scores.</w:t>
+        <w:t xml:space="preserve"> integrating DNA sequence, RNA expression, and spatial transcriptomics to identify tissue-specific disease-risk regions, built around explainability so individual genetic variants map to interpretable spatial microenvironments.</w:t>
       </w:r>
     </w:p>
     <w:p>
@@ -819,7 +841,7 @@
           <w:sz w:val="18"/>
           <w:u w:val="none"/>
         </w:rPr>
-        <w:t>trans-acting NMD-QTLs</w:t>
+        <w:t>trans-acting NMD-QTLs across 48 human tissues</w:t>
       </w:r>
       <w:r>
         <w:rPr>
@@ -830,7 +852,7 @@
           <w:sz w:val="18"/>
           <w:u w:val="none"/>
         </w:rPr>
-        <w:t xml:space="preserve"> associated with nonsense-mediated mRNA decay across human tissues, and benchmarked AlphaGenome and Enigma for spatially resolved variant-to-gene perturbation prediction.</w:t>
+        <w:t>, linking common regulatory variation to nonsense-mediated mRNA decay and exposing a mechanism by which non-coding variants modulate transcript stability and disease risk.</w:t>
       </w:r>
     </w:p>
     <w:p>
@@ -884,29 +906,7 @@
           <w:sz w:val="18"/>
           <w:u w:val="none"/>
         </w:rPr>
-        <w:t xml:space="preserve"> from single-cell RNA-seq, establishing which approaches stay reliable across datasets and where they break down — first-author study in </w:t>
-      </w:r>
-      <w:r>
-        <w:rPr>
-          <w:rFonts w:ascii="Charter" w:hAnsi="Charter" w:cs="Charter"/>
-          <w:b w:val="0"/>
-          <w:i/>
-          <w:color w:val="3A4046"/>
-          <w:sz w:val="18"/>
-          <w:u w:val="none"/>
-        </w:rPr>
-        <w:t>Briefings in Bioinformatics</w:t>
-      </w:r>
-      <w:r>
-        <w:rPr>
-          <w:rFonts w:ascii="Charter" w:hAnsi="Charter" w:cs="Charter"/>
-          <w:b w:val="0"/>
-          <w:i w:val="0"/>
-          <w:color w:val="3A4046"/>
-          <w:sz w:val="18"/>
-          <w:u w:val="none"/>
-        </w:rPr>
-        <w:t>.</w:t>
+        <w:t xml:space="preserve"> from single-cell RNA-seq, establishing which approaches stay reliable across datasets and where they break down, giving the field a basis for method selection rather than convention.</w:t>
       </w:r>
     </w:p>
     <w:p>
@@ -1280,104 +1280,6 @@
     <w:p>
       <w:pPr>
         <w:tabs>
-          <w:tab w:pos="245" w:val="left"/>
-        </w:tabs>
-        <w:spacing w:before="68" w:after="0" w:line="326" w:lineRule="auto"/>
-        <w:ind w:left="245" w:hanging="245"/>
-      </w:pPr>
-      <w:r>
-        <w:rPr>
-          <w:rFonts w:ascii="Charter" w:hAnsi="Charter" w:cs="Charter"/>
-          <w:b w:val="0"/>
-          <w:i w:val="0"/>
-          <w:color w:val="A9B1BA"/>
-          <w:sz w:val="18"/>
-          <w:u w:val="none"/>
-        </w:rPr>
-        <w:t>–</w:t>
-        <w:tab/>
-      </w:r>
-      <w:r>
-        <w:rPr>
-          <w:rFonts w:ascii="Charter" w:hAnsi="Charter" w:cs="Charter"/>
-          <w:b w:val="0"/>
-          <w:i w:val="0"/>
-          <w:color w:val="3A4046"/>
-          <w:sz w:val="18"/>
-          <w:u w:val="none"/>
-        </w:rPr>
-        <w:t xml:space="preserve">Co-authored four resistance-mechanism papers across breast, prostate, and melanoma models in </w:t>
-      </w:r>
-      <w:r>
-        <w:rPr>
-          <w:rFonts w:ascii="Charter" w:hAnsi="Charter" w:cs="Charter"/>
-          <w:b w:val="0"/>
-          <w:i/>
-          <w:color w:val="3A4046"/>
-          <w:sz w:val="18"/>
-          <w:u w:val="none"/>
-        </w:rPr>
-        <w:t>Cell Reports</w:t>
-      </w:r>
-      <w:r>
-        <w:rPr>
-          <w:rFonts w:ascii="Charter" w:hAnsi="Charter" w:cs="Charter"/>
-          <w:b w:val="0"/>
-          <w:i w:val="0"/>
-          <w:color w:val="3A4046"/>
-          <w:sz w:val="18"/>
-          <w:u w:val="none"/>
-        </w:rPr>
-        <w:t xml:space="preserve">, </w:t>
-      </w:r>
-      <w:r>
-        <w:rPr>
-          <w:rFonts w:ascii="Charter" w:hAnsi="Charter" w:cs="Charter"/>
-          <w:b w:val="0"/>
-          <w:i/>
-          <w:color w:val="3A4046"/>
-          <w:sz w:val="18"/>
-          <w:u w:val="none"/>
-        </w:rPr>
-        <w:t>Oncogene</w:t>
-      </w:r>
-      <w:r>
-        <w:rPr>
-          <w:rFonts w:ascii="Charter" w:hAnsi="Charter" w:cs="Charter"/>
-          <w:b w:val="0"/>
-          <w:i w:val="0"/>
-          <w:color w:val="3A4046"/>
-          <w:sz w:val="18"/>
-          <w:u w:val="none"/>
-        </w:rPr>
-        <w:t xml:space="preserve">, and </w:t>
-      </w:r>
-      <w:r>
-        <w:rPr>
-          <w:rFonts w:ascii="Charter" w:hAnsi="Charter" w:cs="Charter"/>
-          <w:b w:val="0"/>
-          <w:i/>
-          <w:color w:val="3A4046"/>
-          <w:sz w:val="18"/>
-          <w:u w:val="none"/>
-        </w:rPr>
-        <w:t>Cancer Research</w:t>
-      </w:r>
-      <w:r>
-        <w:rPr>
-          <w:rFonts w:ascii="Charter" w:hAnsi="Charter" w:cs="Charter"/>
-          <w:b w:val="0"/>
-          <w:i w:val="0"/>
-          <w:color w:val="3A4046"/>
-          <w:sz w:val="18"/>
-          <w:u w:val="none"/>
-        </w:rPr>
-        <w:t>.</w:t>
-      </w:r>
-    </w:p>
-    <w:p>
-      <w:pPr>
-        <w:tabs>
           <w:tab w:pos="10512" w:val="right"/>
         </w:tabs>
         <w:spacing w:before="140" w:after="0" w:line="326" w:lineRule="auto"/>
@@ -1432,7 +1334,7 @@
           <w:sz w:val="17"/>
           <w:u w:val="none"/>
         </w:rPr>
-        <w:t>Predictive clinical informatics · Advisor: Dr. Andrew Michelson</w:t>
+        <w:t>Predictive clinical informatics · Advisors: Dr. Andrew Michelson &amp; Dr. Philip Payne</w:t>
       </w:r>
     </w:p>
     <w:p>
@@ -1464,7 +1366,7 @@
           <w:sz w:val="18"/>
           <w:u w:val="none"/>
         </w:rPr>
-        <w:t xml:space="preserve">Built Lasso and logistic-regression models predicting respiratory failure in COVID-19 patients, and </w:t>
+        <w:t xml:space="preserve">Built Lasso and logistic-regression models predicting respiratory failure in COVID-19 patients and </w:t>
       </w:r>
       <w:r>
         <w:rPr>
@@ -1518,7 +1420,29 @@
           <w:sz w:val="18"/>
           <w:u w:val="none"/>
         </w:rPr>
-        <w:t>Enabled early identification of high-risk patients, supporting timely ICU resource deployment under acute bed and ventilator constraints.</w:t>
+        <w:t xml:space="preserve">Enabled early identification of high-risk patients, </w:t>
+      </w:r>
+      <w:r>
+        <w:rPr>
+          <w:rFonts w:ascii="Charter" w:hAnsi="Charter" w:cs="Charter"/>
+          <w:b/>
+          <w:i w:val="0"/>
+          <w:color w:val="14171A"/>
+          <w:sz w:val="18"/>
+          <w:u w:val="none"/>
+        </w:rPr>
+        <w:t>improving ICU resource allocation</w:t>
+      </w:r>
+      <w:r>
+        <w:rPr>
+          <w:rFonts w:ascii="Charter" w:hAnsi="Charter" w:cs="Charter"/>
+          <w:b w:val="0"/>
+          <w:i w:val="0"/>
+          <w:color w:val="3A4046"/>
+          <w:sz w:val="18"/>
+          <w:u w:val="none"/>
+        </w:rPr>
+        <w:t xml:space="preserve"> under acute bed and ventilator constraints during the peak of the pandemic.</w:t>
       </w:r>
     </w:p>
     <w:p>
@@ -1570,7 +1494,7 @@
           <w:sz w:val="18"/>
           <w:u w:val="none"/>
         </w:rPr>
-        <w:t xml:space="preserve">Engineered and trained a </w:t>
+        <w:t xml:space="preserve">Trained a </w:t>
       </w:r>
       <w:r>
         <w:rPr>
@@ -1603,7 +1527,7 @@
           <w:sz w:val="18"/>
           <w:u w:val="none"/>
         </w:rPr>
-        <w:t>2025</w:t>
+        <w:t xml:space="preserve">2025 · </w:t>
       </w:r>
       <w:r>
         <w:rPr>
@@ -1614,7 +1538,84 @@
           <w:sz w:val="18"/>
           <w:u w:val="none"/>
         </w:rPr>
-        <w:t xml:space="preserve"> — BPE tokenization, data pipeline, and distributed PyTorch DDP across 8×A100 80GB GPUs, managing the full lifecycle including mixed-precision training and gradient-synchronization tuning for cluster throughput.</w:t>
+        <w:t>github.com/Thewhey-Brian/nanochat</w:t>
+      </w:r>
+      <w:r>
+        <w:rPr>
+          <w:rFonts w:ascii="Charter" w:hAnsi="Charter" w:cs="Charter"/>
+          <w:b w:val="0"/>
+          <w:i/>
+          <w:color w:val="3A4046"/>
+          <w:sz w:val="18"/>
+          <w:u w:val="none"/>
+        </w:rPr>
+        <w:t xml:space="preserve"> — built the full pipeline end to end: Rust BPE tokenizer, data loading, base </w:t>
+      </w:r>
+      <w:r>
+        <w:rPr>
+          <w:rFonts w:ascii="Charter" w:hAnsi="Charter" w:cs="Charter"/>
+          <w:b/>
+          <w:i/>
+          <w:color w:val="14171A"/>
+          <w:sz w:val="18"/>
+          <w:u w:val="none"/>
+        </w:rPr>
+        <w:t>pretraining</w:t>
+      </w:r>
+      <w:r>
+        <w:rPr>
+          <w:rFonts w:ascii="Charter" w:hAnsi="Charter" w:cs="Charter"/>
+          <w:b w:val="0"/>
+          <w:i/>
+          <w:color w:val="3A4046"/>
+          <w:sz w:val="18"/>
+          <w:u w:val="none"/>
+        </w:rPr>
+        <w:t xml:space="preserve">, midtraining, </w:t>
+      </w:r>
+      <w:r>
+        <w:rPr>
+          <w:rFonts w:ascii="Charter" w:hAnsi="Charter" w:cs="Charter"/>
+          <w:b/>
+          <w:i/>
+          <w:color w:val="14171A"/>
+          <w:sz w:val="18"/>
+          <w:u w:val="none"/>
+        </w:rPr>
+        <w:t>supervised fine-tuning</w:t>
+      </w:r>
+      <w:r>
+        <w:rPr>
+          <w:rFonts w:ascii="Charter" w:hAnsi="Charter" w:cs="Charter"/>
+          <w:b w:val="0"/>
+          <w:i/>
+          <w:color w:val="3A4046"/>
+          <w:sz w:val="18"/>
+          <w:u w:val="none"/>
+        </w:rPr>
+        <w:t xml:space="preserve">, and </w:t>
+      </w:r>
+      <w:r>
+        <w:rPr>
+          <w:rFonts w:ascii="Charter" w:hAnsi="Charter" w:cs="Charter"/>
+          <w:b/>
+          <w:i/>
+          <w:color w:val="14171A"/>
+          <w:sz w:val="18"/>
+          <w:u w:val="none"/>
+        </w:rPr>
+        <w:t>reinforcement learning</w:t>
+      </w:r>
+      <w:r>
+        <w:rPr>
+          <w:rFonts w:ascii="Charter" w:hAnsi="Charter" w:cs="Charter"/>
+          <w:b w:val="0"/>
+          <w:i/>
+          <w:color w:val="3A4046"/>
+          <w:sz w:val="18"/>
+          <w:u w:val="none"/>
+        </w:rPr>
+        <w:t>, with distributed PyTorch DDP across 8 GPUs, mixed precision, and gradient-synchronization tuning for cluster throughput; evaluated on CORE, ARC, MMLU, GSM8K, and HumanEval.</w:t>
       </w:r>
     </w:p>
     <w:p>

</xml_diff>

<commit_message>
Add cv-edit skill, rewrite README, fix Word lock detection
Package the workflow as a Claude Code skill under .claude/skills/cv-edit
so the editing paths, house style, and claim guardrails travel with the
repo instead of being rediscovered each session.

build.sh globbed for the Word lock file instead of guessing how Word
truncates the "~$" prefix, which had let a sync overwrite a document
that was still open.

Content: applied 2 reviewed edits (trimmed the SEQC2 clause from the
FFPE bullet and "rather than convention" from the cell-cycle bullet).

Co-Authored-By: Claude Opus 5 (1M context) <noreply@anthropic.com>
</commit_message>
<xml_diff>
--- a/dist/Xinyu_Guo_CV.docx
+++ b/dist/Xinyu_Guo_CV.docx
@@ -522,7 +522,7 @@
           <w:sz w:val="18"/>
           <w:u w:val="none"/>
         </w:rPr>
-        <w:t xml:space="preserve"> against 0.677 (FFPErase), 0.517 (FFPolish), and 0.509 (FIFA) on the same cohort, and scaled the pipeline to an 18.6M-row SEQC2 benchmark across five variant callers.</w:t>
+        <w:t xml:space="preserve"> against 0.677 (FFPErase), 0.517 (FFPolish), and 0.509 (FIFA) on the same cohort.</w:t>
       </w:r>
     </w:p>
     <w:p>
@@ -906,7 +906,7 @@
           <w:sz w:val="18"/>
           <w:u w:val="none"/>
         </w:rPr>
-        <w:t xml:space="preserve"> from single-cell RNA-seq, establishing which approaches stay reliable across datasets and where they break down, giving the field a basis for method selection rather than convention.</w:t>
+        <w:t xml:space="preserve"> from single-cell RNA-seq, establishing which approaches stay reliable across datasets and where they break down, giving the field a basis for method selection.</w:t>
       </w:r>
     </w:p>
     <w:p>

</xml_diff>

<commit_message>
Tailor CV toward the Anthropic Life Sciences role
Reframe the evaluation work so benchmark design reads as a first-class
contribution: the cell-cycle study leads as a cross-dataset benchmark, the
FFPE bullet leads with the head-to-head comparison, and the fusion corpus
consolidates its emphasis onto the leakage-safe splits.

Lead the WashU entry with the EHR deployment and fold the ICU-triage impact
into the same bullet. Merge the two state-space projects into one bullet to
free space. Add benchmark design and the canonical sequence databases to the
skills rows.

Co-Authored-By: Claude Fable 5 <noreply@anthropic.com>
</commit_message>
<xml_diff>
--- a/dist/Xinyu_Guo_CV.docx
+++ b/dist/Xinyu_Guo_CV.docx
@@ -478,29 +478,7 @@
           <w:sz w:val="18"/>
           <w:u w:val="none"/>
         </w:rPr>
-        <w:t xml:space="preserve">Built FFPE artifact-risk detection models over </w:t>
-      </w:r>
-      <w:r>
-        <w:rPr>
-          <w:rFonts w:ascii="Charter" w:hAnsi="Charter" w:cs="Charter"/>
-          <w:b/>
-          <w:i w:val="0"/>
-          <w:color w:val="14171A"/>
-          <w:sz w:val="18"/>
-          <w:u w:val="none"/>
-        </w:rPr>
-        <w:t>~140 GB</w:t>
-      </w:r>
-      <w:r>
-        <w:rPr>
-          <w:rFonts w:ascii="Charter" w:hAnsi="Charter" w:cs="Charter"/>
-          <w:b w:val="0"/>
-          <w:i w:val="0"/>
-          <w:color w:val="3A4046"/>
-          <w:sz w:val="18"/>
-          <w:u w:val="none"/>
-        </w:rPr>
-        <w:t xml:space="preserve"> of paired fresh-frozen and FFPE sequencing data, reaching </w:t>
+        <w:t xml:space="preserve">Built FFPE artifact-risk detection models over ~140 GB of paired fresh-frozen and FFPE sequencing data and evaluated them head-to-head against three published tools on a common cohort, reaching </w:t>
       </w:r>
       <w:r>
         <w:rPr>
@@ -522,7 +500,7 @@
           <w:sz w:val="18"/>
           <w:u w:val="none"/>
         </w:rPr>
-        <w:t xml:space="preserve"> against 0.677 (FFPErase), 0.517 (FFPolish), and 0.509 (FIFA) on the same cohort.</w:t>
+        <w:t xml:space="preserve"> against 0.677 (FFPErase), 0.517 (FFPolish), and 0.509 (FIFA).</w:t>
       </w:r>
     </w:p>
     <w:p>
@@ -554,7 +532,7 @@
           <w:sz w:val="18"/>
           <w:u w:val="none"/>
         </w:rPr>
-        <w:t xml:space="preserve">Extended sequence-to-function models from SNVs to structural rearrangements by building a reusable </w:t>
+        <w:t xml:space="preserve">Extended sequence-to-function models from SNVs to structural rearrangements with a reusable SV→REF/ALT encoder that renders deletions, duplications, inversions, breakends, and fusions as model-ready sequence, and curated an </w:t>
       </w:r>
       <w:r>
         <w:rPr>
@@ -565,7 +543,7 @@
           <w:sz w:val="18"/>
           <w:u w:val="none"/>
         </w:rPr>
-        <w:t>SV→REF/ALT encoder</w:t>
+        <w:t>83,048-fusion corpus with leakage-safe splits</w:t>
       </w:r>
       <w:r>
         <w:rPr>
@@ -576,29 +554,7 @@
           <w:sz w:val="18"/>
           <w:u w:val="none"/>
         </w:rPr>
-        <w:t xml:space="preserve"> that renders deletions, duplications, inversions, breakends, and fusions as model-ready sequence, and curated an </w:t>
-      </w:r>
-      <w:r>
-        <w:rPr>
-          <w:rFonts w:ascii="Charter" w:hAnsi="Charter" w:cs="Charter"/>
-          <w:b/>
-          <w:i w:val="0"/>
-          <w:color w:val="14171A"/>
-          <w:sz w:val="18"/>
-          <w:u w:val="none"/>
-        </w:rPr>
-        <w:t>83,048-fusion training corpus</w:t>
-      </w:r>
-      <w:r>
-        <w:rPr>
-          <w:rFonts w:ascii="Charter" w:hAnsi="Charter" w:cs="Charter"/>
-          <w:b w:val="0"/>
-          <w:i w:val="0"/>
-          <w:color w:val="3A4046"/>
-          <w:sz w:val="18"/>
-          <w:u w:val="none"/>
-        </w:rPr>
-        <w:t xml:space="preserve"> across 1,065 cancer types with evidence tiers and leakage-safe splits for supervised fusion modeling.</w:t>
+        <w:t xml:space="preserve"> across 1,065 cancer types and evidence tiers for supervised fusion modeling.</w:t>
       </w:r>
     </w:p>
     <w:p>
@@ -884,7 +840,7 @@
           <w:sz w:val="18"/>
           <w:u w:val="none"/>
         </w:rPr>
-        <w:t xml:space="preserve">Benchmarked methods for </w:t>
+        <w:t xml:space="preserve">Designed a </w:t>
       </w:r>
       <w:r>
         <w:rPr>
@@ -895,7 +851,7 @@
           <w:sz w:val="18"/>
           <w:u w:val="none"/>
         </w:rPr>
-        <w:t>cell-cycle phase inference</w:t>
+        <w:t>cross-dataset benchmark</w:t>
       </w:r>
       <w:r>
         <w:rPr>
@@ -906,7 +862,7 @@
           <w:sz w:val="18"/>
           <w:u w:val="none"/>
         </w:rPr>
-        <w:t xml:space="preserve"> from single-cell RNA-seq, establishing which approaches stay reliable across datasets and where they break down, giving the field a basis for method selection.</w:t>
+        <w:t xml:space="preserve"> for cell-cycle phase inference from single-cell RNA-seq, defining the evaluation protocol and the failure modes that separate methods which generalize from those that do not.</w:t>
       </w:r>
     </w:p>
     <w:p>
@@ -1366,7 +1322,7 @@
           <w:sz w:val="18"/>
           <w:u w:val="none"/>
         </w:rPr>
-        <w:t xml:space="preserve">Built Lasso and logistic-regression models predicting respiratory failure in COVID-19 patients and </w:t>
+        <w:t xml:space="preserve">Shipped Lasso and logistic-regression models predicting respiratory failure in COVID-19 patients </w:t>
       </w:r>
       <w:r>
         <w:rPr>
@@ -1377,7 +1333,7 @@
           <w:sz w:val="18"/>
           <w:u w:val="none"/>
         </w:rPr>
-        <w:t>implemented them in the Barnes-Jewish Hospital EHR</w:t>
+        <w:t>into the Barnes-Jewish Hospital EHR</w:t>
       </w:r>
       <w:r>
         <w:rPr>
@@ -1388,61 +1344,7 @@
           <w:sz w:val="18"/>
           <w:u w:val="none"/>
         </w:rPr>
-        <w:t xml:space="preserve"> — research code that reached live clinical use during the pandemic.</w:t>
-      </w:r>
-    </w:p>
-    <w:p>
-      <w:pPr>
-        <w:tabs>
-          <w:tab w:pos="245" w:val="left"/>
-        </w:tabs>
-        <w:spacing w:before="68" w:after="0" w:line="326" w:lineRule="auto"/>
-        <w:ind w:left="245" w:hanging="245"/>
-      </w:pPr>
-      <w:r>
-        <w:rPr>
-          <w:rFonts w:ascii="Charter" w:hAnsi="Charter" w:cs="Charter"/>
-          <w:b w:val="0"/>
-          <w:i w:val="0"/>
-          <w:color w:val="A9B1BA"/>
-          <w:sz w:val="18"/>
-          <w:u w:val="none"/>
-        </w:rPr>
-        <w:t>–</w:t>
-        <w:tab/>
-      </w:r>
-      <w:r>
-        <w:rPr>
-          <w:rFonts w:ascii="Charter" w:hAnsi="Charter" w:cs="Charter"/>
-          <w:b w:val="0"/>
-          <w:i w:val="0"/>
-          <w:color w:val="3A4046"/>
-          <w:sz w:val="18"/>
-          <w:u w:val="none"/>
-        </w:rPr>
-        <w:t xml:space="preserve">Enabled early identification of high-risk patients, </w:t>
-      </w:r>
-      <w:r>
-        <w:rPr>
-          <w:rFonts w:ascii="Charter" w:hAnsi="Charter" w:cs="Charter"/>
-          <w:b/>
-          <w:i w:val="0"/>
-          <w:color w:val="14171A"/>
-          <w:sz w:val="18"/>
-          <w:u w:val="none"/>
-        </w:rPr>
-        <w:t>improving ICU resource allocation</w:t>
-      </w:r>
-      <w:r>
-        <w:rPr>
-          <w:rFonts w:ascii="Charter" w:hAnsi="Charter" w:cs="Charter"/>
-          <w:b w:val="0"/>
-          <w:i w:val="0"/>
-          <w:color w:val="3A4046"/>
-          <w:sz w:val="18"/>
-          <w:u w:val="none"/>
-        </w:rPr>
-        <w:t xml:space="preserve"> under acute bed and ventilator constraints during the peak of the pandemic.</w:t>
+        <w:t>, where they ran against live patient data during the pandemic peak to flag high-risk patients for ICU triage under acute bed and ventilator constraints.</w:t>
       </w:r>
     </w:p>
     <w:p>
@@ -1641,8 +1543,41 @@
       <w:r>
         <w:rPr>
           <w:rFonts w:ascii="Charter" w:hAnsi="Charter" w:cs="Charter"/>
+          <w:b w:val="0"/>
+          <w:i w:val="0"/>
+          <w:color w:val="3A4046"/>
+          <w:sz w:val="18"/>
+          <w:u w:val="none"/>
+        </w:rPr>
+        <w:t xml:space="preserve">State-space sequence models for long-horizon and edge deployment </w:t>
+      </w:r>
+      <w:r>
+        <w:rPr>
+          <w:rFonts w:ascii="Charter" w:hAnsi="Charter" w:cs="Charter"/>
+          <w:b w:val="0"/>
+          <w:i/>
+          <w:color w:val="3A4046"/>
+          <w:sz w:val="18"/>
+          <w:u w:val="none"/>
+        </w:rPr>
+        <w:t>2025 – 2026 · lead developer / principal architect</w:t>
+      </w:r>
+      <w:r>
+        <w:rPr>
+          <w:rFonts w:ascii="Charter" w:hAnsi="Charter" w:cs="Charter"/>
+          <w:b w:val="0"/>
+          <w:i/>
+          <w:color w:val="3A4046"/>
+          <w:sz w:val="18"/>
+          <w:u w:val="none"/>
+        </w:rPr>
+        <w:t xml:space="preserve"> — </w:t>
+      </w:r>
+      <w:r>
+        <w:rPr>
+          <w:rFonts w:ascii="Charter" w:hAnsi="Charter" w:cs="Charter"/>
           <w:b/>
-          <w:i w:val="0"/>
+          <w:i/>
           <w:color w:val="14171A"/>
           <w:sz w:val="18"/>
           <w:u w:val="none"/>
@@ -1653,12 +1588,23 @@
         <w:rPr>
           <w:rFonts w:ascii="Charter" w:hAnsi="Charter" w:cs="Charter"/>
           <w:b w:val="0"/>
-          <w:i w:val="0"/>
+          <w:i/>
           <w:color w:val="3A4046"/>
           <w:sz w:val="18"/>
           <w:u w:val="none"/>
         </w:rPr>
-        <w:t xml:space="preserve"> </w:t>
+        <w:t xml:space="preserve">, temporal action localization over 2+ hour sequences with efficient state management, cutting memory 68% versus Transformer baselines; and </w:t>
+      </w:r>
+      <w:r>
+        <w:rPr>
+          <w:rFonts w:ascii="Charter" w:hAnsi="Charter" w:cs="Charter"/>
+          <w:b/>
+          <w:i/>
+          <w:color w:val="14171A"/>
+          <w:sz w:val="18"/>
+          <w:u w:val="none"/>
+        </w:rPr>
+        <w:t>Track Mamba</w:t>
       </w:r>
       <w:r>
         <w:rPr>
@@ -1669,149 +1615,7 @@
           <w:sz w:val="18"/>
           <w:u w:val="none"/>
         </w:rPr>
-        <w:t>2025 – 2026 · lead developer</w:t>
-      </w:r>
-      <w:r>
-        <w:rPr>
-          <w:rFonts w:ascii="Charter" w:hAnsi="Charter" w:cs="Charter"/>
-          <w:b w:val="0"/>
-          <w:i/>
-          <w:color w:val="3A4046"/>
-          <w:sz w:val="18"/>
-          <w:u w:val="none"/>
-        </w:rPr>
-        <w:t xml:space="preserve"> — state-space Temporal Action Localization model for long-horizon sequence understanding (2+ hours), with efficient state management over massive temporal datasets, reducing memory usage </w:t>
-      </w:r>
-      <w:r>
-        <w:rPr>
-          <w:rFonts w:ascii="Charter" w:hAnsi="Charter" w:cs="Charter"/>
-          <w:b/>
-          <w:i/>
-          <w:color w:val="14171A"/>
-          <w:sz w:val="18"/>
-          <w:u w:val="none"/>
-        </w:rPr>
-        <w:t>68%</w:t>
-      </w:r>
-      <w:r>
-        <w:rPr>
-          <w:rFonts w:ascii="Charter" w:hAnsi="Charter" w:cs="Charter"/>
-          <w:b w:val="0"/>
-          <w:i/>
-          <w:color w:val="3A4046"/>
-          <w:sz w:val="18"/>
-          <w:u w:val="none"/>
-        </w:rPr>
-        <w:t xml:space="preserve"> versus Transformer baselines.</w:t>
-      </w:r>
-    </w:p>
-    <w:p>
-      <w:pPr>
-        <w:tabs>
-          <w:tab w:pos="245" w:val="left"/>
-        </w:tabs>
-        <w:spacing w:before="68" w:after="0" w:line="326" w:lineRule="auto"/>
-        <w:ind w:left="245" w:hanging="245"/>
-      </w:pPr>
-      <w:r>
-        <w:rPr>
-          <w:rFonts w:ascii="Charter" w:hAnsi="Charter" w:cs="Charter"/>
-          <w:b w:val="0"/>
-          <w:i w:val="0"/>
-          <w:color w:val="A9B1BA"/>
-          <w:sz w:val="18"/>
-          <w:u w:val="none"/>
-        </w:rPr>
-        <w:t>–</w:t>
-        <w:tab/>
-      </w:r>
-      <w:r>
-        <w:rPr>
-          <w:rFonts w:ascii="Charter" w:hAnsi="Charter" w:cs="Charter"/>
-          <w:b/>
-          <w:i w:val="0"/>
-          <w:color w:val="14171A"/>
-          <w:sz w:val="18"/>
-          <w:u w:val="none"/>
-        </w:rPr>
-        <w:t>Track Mamba</w:t>
-      </w:r>
-      <w:r>
-        <w:rPr>
-          <w:rFonts w:ascii="Charter" w:hAnsi="Charter" w:cs="Charter"/>
-          <w:b w:val="0"/>
-          <w:i w:val="0"/>
-          <w:color w:val="3A4046"/>
-          <w:sz w:val="18"/>
-          <w:u w:val="none"/>
-        </w:rPr>
-        <w:t xml:space="preserve"> </w:t>
-      </w:r>
-      <w:r>
-        <w:rPr>
-          <w:rFonts w:ascii="Charter" w:hAnsi="Charter" w:cs="Charter"/>
-          <w:b w:val="0"/>
-          <w:i/>
-          <w:color w:val="3A4046"/>
-          <w:sz w:val="18"/>
-          <w:u w:val="none"/>
-        </w:rPr>
-        <w:t>2025 – 2026 · principal architect</w:t>
-      </w:r>
-      <w:r>
-        <w:rPr>
-          <w:rFonts w:ascii="Charter" w:hAnsi="Charter" w:cs="Charter"/>
-          <w:b w:val="0"/>
-          <w:i/>
-          <w:color w:val="3A4046"/>
-          <w:sz w:val="18"/>
-          <w:u w:val="none"/>
-        </w:rPr>
-        <w:t xml:space="preserve"> — linear-complexity SSM tracker for real-time small-object tracking on edge hardware, </w:t>
-      </w:r>
-      <w:r>
-        <w:rPr>
-          <w:rFonts w:ascii="Charter" w:hAnsi="Charter" w:cs="Charter"/>
-          <w:b/>
-          <w:i/>
-          <w:color w:val="14171A"/>
-          <w:sz w:val="18"/>
-          <w:u w:val="none"/>
-        </w:rPr>
-        <w:t>40% smaller</w:t>
-      </w:r>
-      <w:r>
-        <w:rPr>
-          <w:rFonts w:ascii="Charter" w:hAnsi="Charter" w:cs="Charter"/>
-          <w:b w:val="0"/>
-          <w:i/>
-          <w:color w:val="3A4046"/>
-          <w:sz w:val="18"/>
-          <w:u w:val="none"/>
-        </w:rPr>
-        <w:t xml:space="preserve"> and </w:t>
-      </w:r>
-      <w:r>
-        <w:rPr>
-          <w:rFonts w:ascii="Charter" w:hAnsi="Charter" w:cs="Charter"/>
-          <w:b/>
-          <w:i/>
-          <w:color w:val="14171A"/>
-          <w:sz w:val="18"/>
-          <w:u w:val="none"/>
-        </w:rPr>
-        <w:t>50% faster</w:t>
-      </w:r>
-      <w:r>
-        <w:rPr>
-          <w:rFonts w:ascii="Charter" w:hAnsi="Charter" w:cs="Charter"/>
-          <w:b w:val="0"/>
-          <w:i/>
-          <w:color w:val="3A4046"/>
-          <w:sz w:val="18"/>
-          <w:u w:val="none"/>
-        </w:rPr>
-        <w:t xml:space="preserve"> than TrackNet baselines at higher precision–recall.</w:t>
+        <w:t>, a linear-complexity real-time small-object tracker 40% smaller and 50% faster than TrackNet baselines at higher precision–recall.</w:t>
       </w:r>
     </w:p>
     <w:p>
@@ -2552,7 +2356,7 @@
           <w:sz w:val="18"/>
           <w:u w:val="none"/>
         </w:rPr>
-        <w:t>Genomic foundation models (AlphaGenome, Enigma, Evo2, Carbon, Borzoi, Enformer, DNABERT) · transformers · state-space models (Mamba) · GNN/GAT · self-supervised &amp; contrastive learning · LLM pretraining · agentic systems &amp; tool use · RAG / vector retrieval · leakage-safe evaluation</w:t>
+        <w:t>Genomic foundation models (AlphaGenome, Enigma, Evo2, Carbon, Borzoi, Enformer, DNABERT) · transformers · state-space models (Mamba) · GNN/GAT · self-supervised &amp; contrastive learning · LLM pretraining · agentic systems &amp; tool use · RAG / vector retrieval · benchmark design &amp; leakage-safe evaluation</w:t>
       </w:r>
     </w:p>
     <w:p>
@@ -2580,7 +2384,7 @@
           <w:sz w:val="18"/>
           <w:u w:val="none"/>
         </w:rPr>
-        <w:t>Cancer genomics &amp; precision oncology · variant-effect prediction (SNV, SV, fusion) · regulatory genomics &amp; splicing · GWAS/TWAS · single-cell and spatial transcriptomics · RNA-seq / ChIP-seq / ATAC-seq · NGS somatic calling, FFPE artifacts, VCF · OncoKB, CIViC</w:t>
+        <w:t>Cancer genomics &amp; precision oncology · variant-effect prediction (SNV, SV, fusion) · regulatory genomics &amp; splicing · GWAS/TWAS · single-cell and spatial transcriptomics · RNA-seq / ChIP-seq / ATAC-seq · NGS somatic calling, FFPE artifacts, VCF · Ensembl, NCBI, UniProt, PDB, OncoKB, CIViC</w:t>
       </w:r>
     </w:p>
     <w:p>

</xml_diff>

<commit_message>
Lead Selected Projects with the AlphaGenome evaluation
Point project links at the writeups on xinyuguo.com rather than the raw repo;
the nanochat page already links both the GitHub source and the Hugging Face
demo, so the site link carries more than the repo URL did.

Add the atrial-fibrillation TWAS benchmark as the first project. It is the
most role-relevant item on the site: an independent evaluation of a genomic
foundation model, reported with its negative results intact.

Co-Authored-By: Claude Fable 5 <noreply@anthropic.com>
</commit_message>
<xml_diff>
--- a/dist/Xinyu_Guo_CV.docx
+++ b/dist/Xinyu_Guo_CV.docx
@@ -1396,6 +1396,93 @@
           <w:sz w:val="18"/>
           <w:u w:val="none"/>
         </w:rPr>
+        <w:t xml:space="preserve">Benchmarked </w:t>
+      </w:r>
+      <w:r>
+        <w:rPr>
+          <w:rFonts w:ascii="Charter" w:hAnsi="Charter" w:cs="Charter"/>
+          <w:b/>
+          <w:i w:val="0"/>
+          <w:color w:val="14171A"/>
+          <w:sz w:val="18"/>
+          <w:u w:val="none"/>
+        </w:rPr>
+        <w:t>AlphaGenome</w:t>
+      </w:r>
+      <w:r>
+        <w:rPr>
+          <w:rFonts w:ascii="Charter" w:hAnsi="Charter" w:cs="Charter"/>
+          <w:b w:val="0"/>
+          <w:i w:val="0"/>
+          <w:color w:val="3A4046"/>
+          <w:sz w:val="18"/>
+          <w:u w:val="none"/>
+        </w:rPr>
+        <w:t xml:space="preserve"> against atrial-fibrillation TWAS </w:t>
+      </w:r>
+      <w:r>
+        <w:rPr>
+          <w:rFonts w:ascii="Charter" w:hAnsi="Charter" w:cs="Charter"/>
+          <w:b w:val="0"/>
+          <w:i/>
+          <w:color w:val="3A4046"/>
+          <w:sz w:val="18"/>
+          <w:u w:val="none"/>
+        </w:rPr>
+        <w:t xml:space="preserve">2025 · </w:t>
+      </w:r>
+      <w:r>
+        <w:rPr>
+          <w:rFonts w:ascii="Charter" w:hAnsi="Charter" w:cs="Charter"/>
+          <w:b w:val="0"/>
+          <w:i/>
+          <w:color w:val="3A4046"/>
+          <w:sz w:val="18"/>
+          <w:u w:val="none"/>
+        </w:rPr>
+        <w:t>xinyuguo.com/projects/ag-twas-alphagenome</w:t>
+      </w:r>
+      <w:r>
+        <w:rPr>
+          <w:rFonts w:ascii="Charter" w:hAnsi="Charter" w:cs="Charter"/>
+          <w:b w:val="0"/>
+          <w:i/>
+          <w:color w:val="3A4046"/>
+          <w:sz w:val="18"/>
+          <w:u w:val="none"/>
+        </w:rPr>
+        <w:t xml:space="preserve"> — scored sequence-model predictions on 858 gene–tissue pairs and 10,120 fine-mapped variant–gene–tissue triplets across 10 GTEx tissues; chromatin tracks enriched for causal variants (ATAC 1.18×, P &lt; 10⁻⁴) while expression predictions held only 55–60% sign accuracy, mapping where sequence models can and cannot substitute for genotype-trained methods.</w:t>
+      </w:r>
+    </w:p>
+    <w:p>
+      <w:pPr>
+        <w:tabs>
+          <w:tab w:pos="245" w:val="left"/>
+        </w:tabs>
+        <w:spacing w:before="68" w:after="0" w:line="326" w:lineRule="auto"/>
+        <w:ind w:left="245" w:hanging="245"/>
+      </w:pPr>
+      <w:r>
+        <w:rPr>
+          <w:rFonts w:ascii="Charter" w:hAnsi="Charter" w:cs="Charter"/>
+          <w:b w:val="0"/>
+          <w:i w:val="0"/>
+          <w:color w:val="A9B1BA"/>
+          <w:sz w:val="18"/>
+          <w:u w:val="none"/>
+        </w:rPr>
+        <w:t>–</w:t>
+        <w:tab/>
+      </w:r>
+      <w:r>
+        <w:rPr>
+          <w:rFonts w:ascii="Charter" w:hAnsi="Charter" w:cs="Charter"/>
+          <w:b w:val="0"/>
+          <w:i w:val="0"/>
+          <w:color w:val="3A4046"/>
+          <w:sz w:val="18"/>
+          <w:u w:val="none"/>
+        </w:rPr>
         <w:t xml:space="preserve">Trained a </w:t>
       </w:r>
       <w:r>
@@ -1440,7 +1527,7 @@
           <w:sz w:val="18"/>
           <w:u w:val="none"/>
         </w:rPr>
-        <w:t>github.com/Thewhey-Brian/nanochat</w:t>
+        <w:t>xinyuguo.com/projects/nanochat-llm-training</w:t>
       </w:r>
       <w:r>
         <w:rPr>

</xml_diff>

<commit_message>
Swap SV bullet for whole-slide MIL work in Abbott entry
Replaces the SV->REF/ALT encoder bullet with the UNI2-h whole-slide
multiple-instance learning benchmark. Rebuilt PDF/DOCX; still 2 pages.

Co-Authored-By: Claude Opus 5 <noreply@anthropic.com>
</commit_message>
<xml_diff>
--- a/dist/Xinyu_Guo_CV.docx
+++ b/dist/Xinyu_Guo_CV.docx
@@ -532,7 +532,7 @@
           <w:sz w:val="18"/>
           <w:u w:val="none"/>
         </w:rPr>
-        <w:t xml:space="preserve">Extended sequence-to-function models from SNVs to structural rearrangements with a reusable SV→REF/ALT encoder that renders deletions, duplications, inversions, breakends, and fusions as model-ready sequence, and curated an </w:t>
+        <w:t>Trained multiple-instance learning models on UNI2-h pathology foundation model embeddings over 2,099 whole-slide images from 1,485 patients, predicting ER (</w:t>
       </w:r>
       <w:r>
         <w:rPr>
@@ -543,7 +543,7 @@
           <w:sz w:val="18"/>
           <w:u w:val="none"/>
         </w:rPr>
-        <w:t>83,048-fusion corpus with leakage-safe splits</w:t>
+        <w:t>AUROC 0.890</w:t>
       </w:r>
       <w:r>
         <w:rPr>
@@ -554,7 +554,7 @@
           <w:sz w:val="18"/>
           <w:u w:val="none"/>
         </w:rPr>
-        <w:t xml:space="preserve"> across 1,065 cancer types and evidence tiers for supervised fusion modeling.</w:t>
+        <w:t>), TNBC (0.893), and HRD-high (0.790) from H&amp;E under 5-fold × 3-repeat cross-validation, with every leave-institution-out drop ≤ 0.03; benchmarked gated-attention against mean-pooling aggregation to settle where the added complexity pays.</w:t>
       </w:r>
     </w:p>
     <w:p>

</xml_diff>